<commit_message>
feat: pide fecha y hora de audiencia al generar la Citación a descargos
La plantilla citacion_descargos.docx tenía la tabla "Fecha de la
audiencia" / "Hora" sin ningún campo que la llenara. Se agregan los
placeholders al docx y el modal de Generar documento ahora pide esos
dos datos cuando se elige Citación.

Co-Authored-By: Claude Sonnet 5 <noreply@anthropic.com>
</commit_message>
<xml_diff>
--- a/templates/procesos-disciplinarios/citacion_descargos.docx
+++ b/templates/procesos-disciplinarios/citacion_descargos.docx
@@ -709,6 +709,13 @@
             <w:pPr>
               <w:ind w:left="108"/>
             </w:pPr>
+            <w:r>
+              <w:rPr>
+                <w:rFonts w:ascii="Arial" w:eastAsia="Arial" w:hAnsi="Arial" w:cs="Arial"/>
+                <w:sz w:val="24"/>
+              </w:rPr>
+              <w:t>{fecha_audiencia}</w:t>
+            </w:r>
           </w:p>
         </w:tc>
         <w:tc>
@@ -767,6 +774,13 @@
             <w:pPr>
               <w:ind w:left="108"/>
             </w:pPr>
+            <w:r>
+              <w:rPr>
+                <w:rFonts w:ascii="Arial" w:eastAsia="Arial" w:hAnsi="Arial" w:cs="Arial"/>
+                <w:sz w:val="24"/>
+              </w:rPr>
+              <w:t>{hora_audiencia}</w:t>
+            </w:r>
           </w:p>
         </w:tc>
         <w:tc>

</xml_diff>